<commit_message>
system restructure - moved coal mining and oil and gas extraction from energy supply to mining group
</commit_message>
<xml_diff>
--- a/sector_trajectory_library/families/coal_mining/Coal Mining - Notes.docx
+++ b/sector_trajectory_library/families/coal_mining/Coal Mining - Notes.docx
@@ -131,6 +131,9 @@
     </w:p>
     <w:p>
       <w:r>
+        <w:rPr>
+          <w:noProof/>
+        </w:rPr>
         <w:lastRenderedPageBreak/>
         <w:drawing>
           <wp:inline distT="0" distB="0" distL="0" distR="0" wp14:anchorId="188BDCDE" wp14:editId="1E60A86F">
@@ -172,6 +175,49 @@
     <w:p>
       <w:r>
         <w:drawing>
+          <wp:inline distT="0" distB="0" distL="0" distR="0" wp14:anchorId="3EC6C051" wp14:editId="6839CCC3">
+            <wp:extent cx="5731510" cy="3347085"/>
+            <wp:effectExtent l="0" t="0" r="2540" b="5715"/>
+            <wp:docPr id="226881327" name="Picture 1"/>
+            <wp:cNvGraphicFramePr>
+              <a:graphicFrameLocks xmlns:a="http://schemas.openxmlformats.org/drawingml/2006/main" noChangeAspect="1"/>
+            </wp:cNvGraphicFramePr>
+            <a:graphic xmlns:a="http://schemas.openxmlformats.org/drawingml/2006/main">
+              <a:graphicData uri="http://schemas.openxmlformats.org/drawingml/2006/picture">
+                <pic:pic xmlns:pic="http://schemas.openxmlformats.org/drawingml/2006/picture">
+                  <pic:nvPicPr>
+                    <pic:cNvPr id="226881327" name=""/>
+                    <pic:cNvPicPr/>
+                  </pic:nvPicPr>
+                  <pic:blipFill>
+                    <a:blip r:embed="rId10"/>
+                    <a:stretch>
+                      <a:fillRect/>
+                    </a:stretch>
+                  </pic:blipFill>
+                  <pic:spPr>
+                    <a:xfrm>
+                      <a:off x="0" y="0"/>
+                      <a:ext cx="5731510" cy="3347085"/>
+                    </a:xfrm>
+                    <a:prstGeom prst="rect">
+                      <a:avLst/>
+                    </a:prstGeom>
+                  </pic:spPr>
+                </pic:pic>
+              </a:graphicData>
+            </a:graphic>
+          </wp:inline>
+        </w:drawing>
+      </w:r>
+    </w:p>
+    <w:p>
+      <w:r>
+        <w:rPr>
+          <w:noProof/>
+        </w:rPr>
+        <w:lastRenderedPageBreak/>
+        <w:drawing>
           <wp:inline distT="0" distB="0" distL="0" distR="0" wp14:anchorId="2D1DE9E5" wp14:editId="5BF8B960">
             <wp:extent cx="5731510" cy="817880"/>
             <wp:effectExtent l="0" t="0" r="2540" b="1270"/>
@@ -187,7 +233,7 @@
                     <pic:cNvPicPr/>
                   </pic:nvPicPr>
                   <pic:blipFill>
-                    <a:blip r:embed="rId10"/>
+                    <a:blip r:embed="rId11"/>
                     <a:stretch>
                       <a:fillRect/>
                     </a:stretch>
@@ -213,7 +259,6 @@
         <w:rPr>
           <w:noProof/>
         </w:rPr>
-        <w:lastRenderedPageBreak/>
         <w:drawing>
           <wp:inline distT="0" distB="0" distL="0" distR="0" wp14:anchorId="05B38CAB" wp14:editId="5BD15BE2">
             <wp:extent cx="5731510" cy="4574540"/>
@@ -230,7 +275,7 @@
                     <pic:cNvPicPr/>
                   </pic:nvPicPr>
                   <pic:blipFill>
-                    <a:blip r:embed="rId11"/>
+                    <a:blip r:embed="rId12"/>
                     <a:stretch>
                       <a:fillRect/>
                     </a:stretch>
@@ -272,7 +317,7 @@
                     <pic:cNvPicPr/>
                   </pic:nvPicPr>
                   <pic:blipFill>
-                    <a:blip r:embed="rId12"/>
+                    <a:blip r:embed="rId13"/>
                     <a:stretch>
                       <a:fillRect/>
                     </a:stretch>
@@ -314,7 +359,7 @@
                     <pic:cNvPicPr/>
                   </pic:nvPicPr>
                   <pic:blipFill>
-                    <a:blip r:embed="rId13"/>
+                    <a:blip r:embed="rId14"/>
                     <a:stretch>
                       <a:fillRect/>
                     </a:stretch>
@@ -358,7 +403,7 @@
                     <pic:cNvPicPr/>
                   </pic:nvPicPr>
                   <pic:blipFill>
-                    <a:blip r:embed="rId14"/>
+                    <a:blip r:embed="rId15"/>
                     <a:stretch>
                       <a:fillRect/>
                     </a:stretch>
@@ -380,12 +425,12 @@
       </w:r>
     </w:p>
     <w:sectPr>
-      <w:headerReference w:type="even" r:id="rId15"/>
-      <w:headerReference w:type="default" r:id="rId16"/>
-      <w:footerReference w:type="even" r:id="rId17"/>
-      <w:footerReference w:type="default" r:id="rId18"/>
-      <w:headerReference w:type="first" r:id="rId19"/>
-      <w:footerReference w:type="first" r:id="rId20"/>
+      <w:headerReference w:type="even" r:id="rId16"/>
+      <w:headerReference w:type="default" r:id="rId17"/>
+      <w:footerReference w:type="even" r:id="rId18"/>
+      <w:footerReference w:type="default" r:id="rId19"/>
+      <w:headerReference w:type="first" r:id="rId20"/>
+      <w:footerReference w:type="first" r:id="rId21"/>
       <w:pgSz w:w="11906" w:h="16838"/>
       <w:pgMar w:top="1440" w:right="1440" w:bottom="1440" w:left="1440" w:header="708" w:footer="708" w:gutter="0"/>
       <w:cols w:space="708"/>

</xml_diff>

<commit_message>
updated notes document for the coal mining sector
</commit_message>
<xml_diff>
--- a/sector_trajectory_library/families/coal_mining/Coal Mining - Notes.docx
+++ b/sector_trajectory_library/families/coal_mining/Coal Mining - Notes.docx
@@ -213,10 +213,49 @@
     </w:p>
     <w:p>
       <w:r>
+        <w:lastRenderedPageBreak/>
+        <w:drawing>
+          <wp:inline distT="0" distB="0" distL="0" distR="0" wp14:anchorId="5AC92AAC" wp14:editId="5E1BDFF5">
+            <wp:extent cx="5731510" cy="2281555"/>
+            <wp:effectExtent l="0" t="0" r="2540" b="4445"/>
+            <wp:docPr id="348894590" name="Picture 1"/>
+            <wp:cNvGraphicFramePr>
+              <a:graphicFrameLocks xmlns:a="http://schemas.openxmlformats.org/drawingml/2006/main" noChangeAspect="1"/>
+            </wp:cNvGraphicFramePr>
+            <a:graphic xmlns:a="http://schemas.openxmlformats.org/drawingml/2006/main">
+              <a:graphicData uri="http://schemas.openxmlformats.org/drawingml/2006/picture">
+                <pic:pic xmlns:pic="http://schemas.openxmlformats.org/drawingml/2006/picture">
+                  <pic:nvPicPr>
+                    <pic:cNvPr id="348894590" name=""/>
+                    <pic:cNvPicPr/>
+                  </pic:nvPicPr>
+                  <pic:blipFill>
+                    <a:blip r:embed="rId11"/>
+                    <a:stretch>
+                      <a:fillRect/>
+                    </a:stretch>
+                  </pic:blipFill>
+                  <pic:spPr>
+                    <a:xfrm>
+                      <a:off x="0" y="0"/>
+                      <a:ext cx="5731510" cy="2281555"/>
+                    </a:xfrm>
+                    <a:prstGeom prst="rect">
+                      <a:avLst/>
+                    </a:prstGeom>
+                  </pic:spPr>
+                </pic:pic>
+              </a:graphicData>
+            </a:graphic>
+          </wp:inline>
+        </w:drawing>
+      </w:r>
+    </w:p>
+    <w:p>
+      <w:r>
         <w:rPr>
           <w:noProof/>
         </w:rPr>
-        <w:lastRenderedPageBreak/>
         <w:drawing>
           <wp:inline distT="0" distB="0" distL="0" distR="0" wp14:anchorId="2D1DE9E5" wp14:editId="5BF8B960">
             <wp:extent cx="5731510" cy="817880"/>
@@ -233,7 +272,7 @@
                     <pic:cNvPicPr/>
                   </pic:nvPicPr>
                   <pic:blipFill>
-                    <a:blip r:embed="rId11"/>
+                    <a:blip r:embed="rId12"/>
                     <a:stretch>
                       <a:fillRect/>
                     </a:stretch>
@@ -275,7 +314,7 @@
                     <pic:cNvPicPr/>
                   </pic:nvPicPr>
                   <pic:blipFill>
-                    <a:blip r:embed="rId12"/>
+                    <a:blip r:embed="rId13"/>
                     <a:stretch>
                       <a:fillRect/>
                     </a:stretch>
@@ -301,6 +340,7 @@
         <w:rPr>
           <w:noProof/>
         </w:rPr>
+        <w:lastRenderedPageBreak/>
         <w:drawing>
           <wp:inline distT="0" distB="0" distL="0" distR="0" wp14:anchorId="2B46F2A8" wp14:editId="04CC33DE">
             <wp:extent cx="5731510" cy="1609725"/>
@@ -317,7 +357,7 @@
                     <pic:cNvPicPr/>
                   </pic:nvPicPr>
                   <pic:blipFill>
-                    <a:blip r:embed="rId13"/>
+                    <a:blip r:embed="rId14"/>
                     <a:stretch>
                       <a:fillRect/>
                     </a:stretch>
@@ -359,7 +399,7 @@
                     <pic:cNvPicPr/>
                   </pic:nvPicPr>
                   <pic:blipFill>
-                    <a:blip r:embed="rId14"/>
+                    <a:blip r:embed="rId15"/>
                     <a:stretch>
                       <a:fillRect/>
                     </a:stretch>
@@ -386,7 +426,6 @@
         <w:rPr>
           <w:noProof/>
         </w:rPr>
-        <w:lastRenderedPageBreak/>
         <w:drawing>
           <wp:inline distT="0" distB="0" distL="0" distR="0" wp14:anchorId="311B41B0" wp14:editId="371839F9">
             <wp:extent cx="5731510" cy="2426970"/>
@@ -403,7 +442,7 @@
                     <pic:cNvPicPr/>
                   </pic:nvPicPr>
                   <pic:blipFill>
-                    <a:blip r:embed="rId15"/>
+                    <a:blip r:embed="rId16"/>
                     <a:stretch>
                       <a:fillRect/>
                     </a:stretch>
@@ -425,12 +464,12 @@
       </w:r>
     </w:p>
     <w:sectPr>
-      <w:headerReference w:type="even" r:id="rId16"/>
-      <w:headerReference w:type="default" r:id="rId17"/>
-      <w:footerReference w:type="even" r:id="rId18"/>
-      <w:footerReference w:type="default" r:id="rId19"/>
-      <w:headerReference w:type="first" r:id="rId20"/>
-      <w:footerReference w:type="first" r:id="rId21"/>
+      <w:headerReference w:type="even" r:id="rId17"/>
+      <w:headerReference w:type="default" r:id="rId18"/>
+      <w:footerReference w:type="even" r:id="rId19"/>
+      <w:footerReference w:type="default" r:id="rId20"/>
+      <w:headerReference w:type="first" r:id="rId21"/>
+      <w:footerReference w:type="first" r:id="rId22"/>
       <w:pgSz w:w="11906" w:h="16838"/>
       <w:pgMar w:top="1440" w:right="1440" w:bottom="1440" w:left="1440" w:header="708" w:footer="708" w:gutter="0"/>
       <w:cols w:space="708"/>

</xml_diff>

<commit_message>
updated calibration for non-road transport
</commit_message>
<xml_diff>
--- a/sector_trajectory_library/families/coal_mining/Coal Mining - Notes.docx
+++ b/sector_trajectory_library/families/coal_mining/Coal Mining - Notes.docx
@@ -174,6 +174,9 @@
     </w:p>
     <w:p>
       <w:r>
+        <w:rPr>
+          <w:noProof/>
+        </w:rPr>
         <w:drawing>
           <wp:inline distT="0" distB="0" distL="0" distR="0" wp14:anchorId="3EC6C051" wp14:editId="6839CCC3">
             <wp:extent cx="5731510" cy="3347085"/>
@@ -213,6 +216,9 @@
     </w:p>
     <w:p>
       <w:r>
+        <w:rPr>
+          <w:noProof/>
+        </w:rPr>
         <w:lastRenderedPageBreak/>
         <w:drawing>
           <wp:inline distT="0" distB="0" distL="0" distR="0" wp14:anchorId="5AC92AAC" wp14:editId="5E1BDFF5">
@@ -463,13 +469,53 @@
         </w:drawing>
       </w:r>
     </w:p>
+    <w:p>
+      <w:r>
+        <w:t xml:space="preserve">Coal price caps: </w:t>
+      </w:r>
+    </w:p>
+    <w:p>
+      <w:r>
+        <w:t xml:space="preserve">From 1 July 2023, the Australian Government capped the price of coal used to generate electricity at A$125 a tonne in collaboration with the New South Wales and Queensland Governments. It was part of </w:t>
+      </w:r>
+      <w:proofErr w:type="gramStart"/>
+      <w:r>
+        <w:t>an</w:t>
+      </w:r>
+      <w:proofErr w:type="gramEnd"/>
+      <w:r>
+        <w:t xml:space="preserve"> A$1.5bn programme meant to reduce annual utility costs for customers by roughly A$230. </w:t>
+      </w:r>
+    </w:p>
+    <w:p>
+      <w:r>
+        <w:t>References:</w:t>
+      </w:r>
+    </w:p>
+    <w:p>
+      <w:r>
+        <w:t xml:space="preserve">420 Mt coal production (in 2020-2021) - </w:t>
+      </w:r>
+      <w:hyperlink r:id="rId17" w:history="1">
+        <w:r>
+          <w:rPr>
+            <w:rStyle w:val="Hyperlink"/>
+          </w:rPr>
+          <w:t>Can Australia ever give up coal? - Mine Australia | Issue 40 | February 2024</w:t>
+        </w:r>
+      </w:hyperlink>
+      <w:r>
+        <w:t xml:space="preserve">. </w:t>
+      </w:r>
+    </w:p>
+    <w:p/>
     <w:sectPr>
-      <w:headerReference w:type="even" r:id="rId17"/>
-      <w:headerReference w:type="default" r:id="rId18"/>
-      <w:footerReference w:type="even" r:id="rId19"/>
-      <w:footerReference w:type="default" r:id="rId20"/>
-      <w:headerReference w:type="first" r:id="rId21"/>
-      <w:footerReference w:type="first" r:id="rId22"/>
+      <w:headerReference w:type="even" r:id="rId18"/>
+      <w:headerReference w:type="default" r:id="rId19"/>
+      <w:footerReference w:type="even" r:id="rId20"/>
+      <w:footerReference w:type="default" r:id="rId21"/>
+      <w:headerReference w:type="first" r:id="rId22"/>
+      <w:footerReference w:type="first" r:id="rId23"/>
       <w:pgSz w:w="11906" w:h="16838"/>
       <w:pgMar w:top="1440" w:right="1440" w:bottom="1440" w:left="1440" w:header="708" w:footer="708" w:gutter="0"/>
       <w:cols w:space="708"/>
@@ -1912,7 +1958,6 @@
   <w:style w:type="character" w:default="1" w:styleId="DefaultParagraphFont">
     <w:name w:val="Default Paragraph Font"/>
     <w:uiPriority w:val="1"/>
-    <w:semiHidden/>
     <w:unhideWhenUsed/>
   </w:style>
   <w:style w:type="table" w:default="1" w:styleId="TableNormal">
@@ -2269,6 +2314,29 @@
     <w:link w:val="Footer"/>
     <w:uiPriority w:val="99"/>
     <w:rsid w:val="00C60441"/>
+  </w:style>
+  <w:style w:type="character" w:styleId="Hyperlink">
+    <w:name w:val="Hyperlink"/>
+    <w:basedOn w:val="DefaultParagraphFont"/>
+    <w:uiPriority w:val="99"/>
+    <w:unhideWhenUsed/>
+    <w:rsid w:val="000019C8"/>
+    <w:rPr>
+      <w:color w:val="467886" w:themeColor="hyperlink"/>
+      <w:u w:val="single"/>
+    </w:rPr>
+  </w:style>
+  <w:style w:type="character" w:styleId="UnresolvedMention">
+    <w:name w:val="Unresolved Mention"/>
+    <w:basedOn w:val="DefaultParagraphFont"/>
+    <w:uiPriority w:val="99"/>
+    <w:semiHidden/>
+    <w:unhideWhenUsed/>
+    <w:rsid w:val="000019C8"/>
+    <w:rPr>
+      <w:color w:val="605E5C"/>
+      <w:shd w:val="clear" w:color="auto" w:fill="E1DFDD"/>
+    </w:rPr>
   </w:style>
 </w:styles>
 </file>

</xml_diff>